<commit_message>
test(docx): sample phủ 12 quy tắc + nhãn inline, verify khớp output
Sửa hành vi DOCX-07/08 bị gán sai: text box (mc:AlternateContent) chữ
SỐNG SÓT nhưng bị dồn ra cuối đoạn (rối thứ tự đọc) -> DOCX-07 hạ xuống
[NÊN]; SmartArt/đồ hoạ DrawingML không có VML fallback mới thực sự mất
chữ -> DOCX-08 giữ [TRÁNH]. Cập nhật sample, verify_docx và convention-docx.md
cho khớp output MarkItDown quan sát thực tế. Full suite ALL PASS.

Co-Authored-By: Claude Opus 4.8 <noreply@anthropic.com>
</commit_message>
<xml_diff>
--- a/samples/docx-bad.docx
+++ b/samples/docx-bad.docx
@@ -8,7 +8,7 @@
           <w:b/>
           <w:sz w:val="32"/>
         </w:rPr>
-        <w:t>Báo cáo doanh thu 2026</w:t>
+        <w:t>Báo cáo doanh thu 2026 [vi phạm DOCX-01: bold+cỡ chữ]</w:t>
       </w:r>
     </w:p>
     <w:tbl>
@@ -28,7 +28,7 @@
           </w:tcPr>
           <w:p>
             <w:r>
-              <w:t>Doanh thu theo tháng</w:t>
+              <w:t>Doanh thu theo tháng [vi phạm DOCX-02: merge]</w:t>
             </w:r>
           </w:p>
         </w:tc>
@@ -80,6 +80,11 @@
     </w:tbl>
     <w:p>
       <w:r>
+        <w:t>Ràng buộc a^2+b^2 chỉ tồn tại trong ảnh dưới đây [vi phạm DOCX-05]:</w:t>
+      </w:r>
+    </w:p>
+    <w:p>
+      <w:r>
         <w:drawing>
           <wp:inline xmlns:a="http://schemas.openxmlformats.org/drawingml/2006/main" xmlns:pic="http://schemas.openxmlformats.org/drawingml/2006/picture">
             <wp:extent cx="914400" cy="914400"/>
@@ -95,7 +100,150 @@
                     <pic:cNvPicPr/>
                   </pic:nvPicPr>
                   <pic:blipFill>
-                    <a:blip r:embed="rId9"/>
+                    <a:blip r:embed="rId10"/>
+                    <a:stretch>
+                      <a:fillRect/>
+                    </a:stretch>
+                  </pic:blipFill>
+                  <pic:spPr>
+                    <a:xfrm>
+                      <a:off x="0" y="0"/>
+                      <a:ext cx="914400" cy="914400"/>
+                    </a:xfrm>
+                    <a:prstGeom prst="rect"/>
+                  </pic:spPr>
+                </pic:pic>
+              </a:graphicData>
+            </a:graphic>
+          </wp:inline>
+        </w:drawing>
+      </w:r>
+    </w:p>
+    <w:p>
+      <w:r>
+        <w:t xml:space="preserve">Doanh thu quý 1: </w:t>
+      </w:r>
+      <w:r xmlns:a="http://schemas.openxmlformats.org/drawingml/2006/main">
+        <mc:AlternateContent>
+          <mc:Choice Requires="wps">
+            <w:drawing>
+              <wp:inline>
+                <wp:extent cx="2000000" cy="500000"/>
+                <wp:docPr id="11" name="TextBox"/>
+                <a:graphic>
+                  <a:graphicData uri="http://schemas.microsoft.com/office/word/2010/wordprocessingShape">
+                    <wps:wsp>
+                      <wps:txbx>
+                        <w:txbxContent>
+                          <w:p>
+                            <w:r>
+                              <w:t xml:space="preserve">ĐẠT 600 TRIỆU</w:t>
+                            </w:r>
+                          </w:p>
+                        </w:txbxContent>
+                      </wps:txbx>
+                      <wps:bodyPr/>
+                    </wps:wsp>
+                  </a:graphicData>
+                </a:graphic>
+              </wp:inline>
+            </w:drawing>
+          </mc:Choice>
+          <mc:Fallback>
+            <w:pict>
+              <v:shape style="width:220pt;height:36pt">
+                <v:textbox>
+                  <w:txbxContent>
+                    <w:p>
+                      <w:r>
+                        <w:t xml:space="preserve">ĐẠT 600 TRIỆU</w:t>
+                      </w:r>
+                    </w:p>
+                  </w:txbxContent>
+                </v:textbox>
+              </v:shape>
+            </w:pict>
+          </mc:Fallback>
+        </mc:AlternateContent>
+      </w:r>
+      <w:r>
+        <w:t xml:space="preserve"> — đã kiểm toán. [vi phạm DOCX-07]</w:t>
+      </w:r>
+    </w:p>
+    <w:p>
+      <w:r>
+        <w:t>Sơ đồ quy trình dưới đây là SmartArt/đồ hoạ, chữ bên trong sẽ MẤT [vi phạm DOCX-08]:</w:t>
+      </w:r>
+    </w:p>
+    <w:p>
+      <w:r xmlns:a="http://schemas.openxmlformats.org/drawingml/2006/main">
+        <w:drawing>
+          <wp:inline distT="0" distB="0" distL="0" distR="0">
+            <wp:extent cx="2000000" cy="500000"/>
+            <wp:docPr id="12" name="Graphic"/>
+            <a:graphic>
+              <a:graphicData uri="http://schemas.microsoft.com/office/word/2010/wordprocessingShape">
+                <wps:wsp>
+                  <wps:txbx>
+                    <w:txbxContent>
+                      <w:p>
+                        <w:r>
+                          <w:t xml:space="preserve">KHẢO SÁT → PHÂN TÍCH → CHỐT</w:t>
+                        </w:r>
+                      </w:p>
+                    </w:txbxContent>
+                  </wps:txbx>
+                  <wps:bodyPr/>
+                </wps:wsp>
+              </a:graphicData>
+            </a:graphic>
+          </wp:inline>
+        </w:drawing>
+      </w:r>
+    </w:p>
+    <w:p>
+      <w:r>
+        <w:t xml:space="preserve">Câu có sửa đổi đang treo [vi phạm DOCX-06]: </w:t>
+      </w:r>
+      <w:ins w:id="1" w:author="reviewer" w:date="2026-07-15T00:00:00Z">
+        <w:r>
+          <w:t xml:space="preserve">PHẦN CHÈN ĐANG TREO</w:t>
+        </w:r>
+      </w:ins>
+    </w:p>
+    <w:p>
+      <w:r>
+        <w:t>- Bước khảo sát (gõ tay) [vi phạm DOCX-11]</w:t>
+      </w:r>
+    </w:p>
+    <w:p>
+      <w:r>
+        <w:t>- Bước chốt tính năng (gõ tay)</w:t>
+      </w:r>
+    </w:p>
+    <w:p>
+      <w:r>
+        <w:t>Bảng số liệu bên dưới chỉ là ảnh chụp, không có bản chữ [vi phạm DOCX-04]:</w:t>
+      </w:r>
+    </w:p>
+    <w:p>
+      <w:r>
+        <w:drawing>
+          <wp:inline xmlns:a="http://schemas.openxmlformats.org/drawingml/2006/main" xmlns:pic="http://schemas.openxmlformats.org/drawingml/2006/picture">
+            <wp:extent cx="914400" cy="914400"/>
+            <wp:docPr id="13" name="Picture 13"/>
+            <wp:cNvGraphicFramePr>
+              <a:graphicFrameLocks noChangeAspect="1"/>
+            </wp:cNvGraphicFramePr>
+            <a:graphic>
+              <a:graphicData uri="http://schemas.openxmlformats.org/drawingml/2006/picture">
+                <pic:pic>
+                  <pic:nvPicPr>
+                    <pic:cNvPr id="0" name="image.png"/>
+                    <pic:cNvPicPr/>
+                  </pic:nvPicPr>
+                  <pic:blipFill>
+                    <a:blip r:embed="rId10"/>
                     <a:stretch>
                       <a:fillRect/>
                     </a:stretch>
@@ -115,6 +263,7 @@
       </w:r>
     </w:p>
     <w:sectPr>
+      <w:headerReference w:type="default" r:id="rId9"/>
       <w:pgSz w:w="12240" w:h="15840"/>
       <w:pgMar w:top="1440" w:right="1800" w:bottom="1440" w:left="1800" w:header="720" w:footer="720" w:gutter="0"/>
       <w:cols w:space="720"/>
@@ -122,6 +271,19 @@
     </w:sectPr>
   </w:body>
 </w:document>
+</file>
+
+<file path=word/header1.xml><?xml version="1.0" encoding="utf-8"?>
+<w:hdr xmlns:m="http://schemas.openxmlformats.org/officeDocument/2006/math" xmlns:mc="http://schemas.openxmlformats.org/markup-compatibility/2006" xmlns:mo="http://schemas.microsoft.com/office/mac/office/2008/main" xmlns:mv="urn:schemas-microsoft-com:mac:vml" xmlns:o="urn:schemas-microsoft-com:office:office" xmlns:r="http://schemas.openxmlformats.org/officeDocument/2006/relationships" xmlns:v="urn:schemas-microsoft-com:vml" xmlns:w10="urn:schemas-microsoft-com:office:word" xmlns:w14="http://schemas.microsoft.com/office/word/2010/wordml" xmlns:w="http://schemas.openxmlformats.org/wordprocessingml/2006/main" xmlns:wne="http://schemas.microsoft.com/office/word/2006/wordml" xmlns:wp14="http://schemas.microsoft.com/office/word/2010/wordprocessingDrawing" xmlns:wp="http://schemas.openxmlformats.org/drawingml/2006/wordprocessingDrawing" xmlns:wpc="http://schemas.microsoft.com/office/word/2010/wordprocessingCanvas" xmlns:wpg="http://schemas.microsoft.com/office/word/2010/wordprocessingGroup" xmlns:wpi="http://schemas.microsoft.com/office/word/2010/wordprocessingInk" xmlns:wps="http://schemas.microsoft.com/office/word/2010/wordprocessingShape" mc:Ignorable="w14 wp14">
+  <w:p>
+    <w:pPr>
+      <w:pStyle w:val="Header"/>
+    </w:pPr>
+    <w:r>
+      <w:t>Mã dự án DT-2026 [vi phạm DOCX-09: đặt trong header, sẽ biến mất]</w:t>
+    </w:r>
+  </w:p>
+</w:hdr>
 </file>
 
 <file path=word/numbering.xml><?xml version="1.0" encoding="utf-8"?>

</xml_diff>